<commit_message>
Heat Pump date to Aug 2022 kickoff; Book a call buttons ready for Calendly link
Co-Authored-By: Claude Opus 5.5 <noreply@anthropic.com>
Claude-Session: https://claude.ai/code/session_01MFRrTt7LBDdX57m85KHNGp
</commit_message>
<xml_diff>
--- a/assets/resume/Madhan-Irulandi-Resume.docx
+++ b/assets/resume/Madhan-Irulandi-Resume.docx
@@ -51,7 +51,7 @@
         </w:rPr>
         <w:t xml:space="preserve">Chennai, India (open to relocation worldwide)  •  irulandi.madhan@gmail.com  •  </w:t>
       </w:r>
-      <w:hyperlink w:history="1" r:id="rId8ss0baaa6_v2y3f-o-wez">
+      <w:hyperlink w:history="1" r:id="rIdui68iuaydh6kxapf8wopj">
         <w:r>
           <w:rPr>
             <w:rFonts w:ascii="Calibri" w:cs="Calibri" w:eastAsia="Calibri" w:hAnsi="Calibri"/>
@@ -72,7 +72,7 @@
         </w:rPr>
         <w:t xml:space="preserve">  •  </w:t>
       </w:r>
-      <w:hyperlink w:history="1" r:id="rIdx3xcobmxi_jk6sjha-jre">
+      <w:hyperlink w:history="1" r:id="rIdkyd68dwcelj0ecyc6aj3z">
         <w:r>
           <w:rPr>
             <w:rFonts w:ascii="Calibri" w:cs="Calibri" w:eastAsia="Calibri" w:hAnsi="Calibri"/>
@@ -1664,7 +1664,7 @@
           <w:sz w:val="20"/>
           <w:szCs w:val="20"/>
         </w:rPr>
-        <w:t xml:space="preserve">Coordinated volunteers and mentored developers on the Urban League Heat Pump app (from Jul 2022) and the National Police Data Coalition project (from Apr 2023).</w:t>
+        <w:t xml:space="preserve">Coordinated volunteers and mentored developers on the Urban League Heat Pump app (from Aug 2022) and the National Police Data Coalition project (from Apr 2023).</w:t>
       </w:r>
     </w:p>
     <w:sectPr>

</xml_diff>

<commit_message>
Code for Boston: describe role as volunteer member, never organiser
Co-Authored-By: Claude Opus 5.5 <noreply@anthropic.com>
Claude-Session: https://claude.ai/code/session_01MFRrTt7LBDdX57m85KHNGp
</commit_message>
<xml_diff>
--- a/assets/resume/Madhan-Irulandi-Resume.docx
+++ b/assets/resume/Madhan-Irulandi-Resume.docx
@@ -51,7 +51,7 @@
         </w:rPr>
         <w:t xml:space="preserve">Chennai, India (open to relocation worldwide)  •  irulandi.madhan@gmail.com  •  </w:t>
       </w:r>
-      <w:hyperlink w:history="1" r:id="rIdui68iuaydh6kxapf8wopj">
+      <w:hyperlink w:history="1" r:id="rIdm2e-zgaucrpulq3q_bqrf">
         <w:r>
           <w:rPr>
             <w:rFonts w:ascii="Calibri" w:cs="Calibri" w:eastAsia="Calibri" w:hAnsi="Calibri"/>
@@ -72,7 +72,7 @@
         </w:rPr>
         <w:t xml:space="preserve">  •  </w:t>
       </w:r>
-      <w:hyperlink w:history="1" r:id="rIdkyd68dwcelj0ecyc6aj3z">
+      <w:hyperlink w:history="1" r:id="rIdx6faohv7dvv1cksd_uvnd">
         <w:r>
           <w:rPr>
             <w:rFonts w:ascii="Calibri" w:cs="Calibri" w:eastAsia="Calibri" w:hAnsi="Calibri"/>
@@ -1664,7 +1664,7 @@
           <w:sz w:val="20"/>
           <w:szCs w:val="20"/>
         </w:rPr>
-        <w:t xml:space="preserve">Coordinated volunteers and mentored developers on the Urban League Heat Pump app (from Aug 2022) and the National Police Data Coalition project (from Apr 2023).</w:t>
+        <w:t xml:space="preserve">Volunteer member; helped coordinate tasks and mentored developers on the Urban League Heat Pump app (from Aug 2022) and the National Police Data Coalition project (from Apr 2023).</w:t>
       </w:r>
     </w:p>
     <w:sectPr>

</xml_diff>

<commit_message>
Code for Boston: non-technical volunteer role, Sep 2022 – Aug 2025 dates
Co-Authored-By: Claude Opus 5.5 <noreply@anthropic.com>
Claude-Session: https://claude.ai/code/session_01MFRrTt7LBDdX57m85KHNGp
</commit_message>
<xml_diff>
--- a/assets/resume/Madhan-Irulandi-Resume.docx
+++ b/assets/resume/Madhan-Irulandi-Resume.docx
@@ -51,7 +51,7 @@
         </w:rPr>
         <w:t xml:space="preserve">Chennai, India (open to relocation worldwide)  •  irulandi.madhan@gmail.com  •  </w:t>
       </w:r>
-      <w:hyperlink w:history="1" r:id="rIdm2e-zgaucrpulq3q_bqrf">
+      <w:hyperlink w:history="1" r:id="rIdwynr9i2hff8jehm7cbvmn">
         <w:r>
           <w:rPr>
             <w:rFonts w:ascii="Calibri" w:cs="Calibri" w:eastAsia="Calibri" w:hAnsi="Calibri"/>
@@ -72,7 +72,7 @@
         </w:rPr>
         <w:t xml:space="preserve">  •  </w:t>
       </w:r>
-      <w:hyperlink w:history="1" r:id="rIdx6faohv7dvv1cksd_uvnd">
+      <w:hyperlink w:history="1" r:id="rIduw7bkhqrmjjsm_vwl1c-b">
         <w:r>
           <w:rPr>
             <w:rFonts w:ascii="Calibri" w:cs="Calibri" w:eastAsia="Calibri" w:hAnsi="Calibri"/>
@@ -1664,7 +1664,7 @@
           <w:sz w:val="20"/>
           <w:szCs w:val="20"/>
         </w:rPr>
-        <w:t xml:space="preserve">Volunteer member; helped coordinate tasks and mentored developers on the Urban League Heat Pump app (from Aug 2022) and the National Police Data Coalition project (from Apr 2023).</w:t>
+        <w:t xml:space="preserve">Volunteer member on the non-technical side (Sep 2022 – Aug 2025), helping newcomers set up cloud accounts and tools on the Urban League Heat Pump Accelerator and the National Police Data Coalition.</w:t>
       </w:r>
     </w:p>
     <w:sectPr>

</xml_diff>

<commit_message>
Code for Boston: add MAPLE and HEAT projects
Co-Authored-By: Claude Opus 5.5 <noreply@anthropic.com>
Claude-Session: https://claude.ai/code/session_01MFRrTt7LBDdX57m85KHNGp
</commit_message>
<xml_diff>
--- a/assets/resume/Madhan-Irulandi-Resume.docx
+++ b/assets/resume/Madhan-Irulandi-Resume.docx
@@ -51,7 +51,7 @@
         </w:rPr>
         <w:t xml:space="preserve">Chennai, India (open to relocation worldwide)  •  irulandi.madhan@gmail.com  •  </w:t>
       </w:r>
-      <w:hyperlink w:history="1" r:id="rIdwynr9i2hff8jehm7cbvmn">
+      <w:hyperlink w:history="1" r:id="rIdv8jwz2sh18o3jdpan0bwl">
         <w:r>
           <w:rPr>
             <w:rFonts w:ascii="Calibri" w:cs="Calibri" w:eastAsia="Calibri" w:hAnsi="Calibri"/>
@@ -72,7 +72,7 @@
         </w:rPr>
         <w:t xml:space="preserve">  •  </w:t>
       </w:r>
-      <w:hyperlink w:history="1" r:id="rIduw7bkhqrmjjsm_vwl1c-b">
+      <w:hyperlink w:history="1" r:id="rIdpdd6cvkylnarqslcgsb2m">
         <w:r>
           <w:rPr>
             <w:rFonts w:ascii="Calibri" w:cs="Calibri" w:eastAsia="Calibri" w:hAnsi="Calibri"/>
@@ -1664,7 +1664,7 @@
           <w:sz w:val="20"/>
           <w:szCs w:val="20"/>
         </w:rPr>
-        <w:t xml:space="preserve">Volunteer member on the non-technical side (Sep 2022 – Aug 2025), helping newcomers set up cloud accounts and tools on the Urban League Heat Pump Accelerator and the National Police Data Coalition.</w:t>
+        <w:t xml:space="preserve">Volunteer member on the non-technical side (Sep 2022 – Aug 2025), helping newcomers set up cloud accounts and tools on four projects: MAPLE, the Urban League Heat Pump Accelerator, the National Police Data Coalition and HEAT.</w:t>
       </w:r>
     </w:p>
     <w:sectPr>

</xml_diff>

<commit_message>
John Hancock: legacy AWD (EnCorr, Viewstation) to SS&C Chorus BPM move on site, blog and resume.
Co-Authored-By: Claude Opus 5.5 <noreply@anthropic.com>
Claude-Session: https://claude.ai/code/session_01MFRrTt7LBDdX57m85KHNGp
</commit_message>
<xml_diff>
--- a/assets/resume/Madhan-Irulandi-Resume.docx
+++ b/assets/resume/Madhan-Irulandi-Resume.docx
@@ -51,7 +51,7 @@
         </w:rPr>
         <w:t xml:space="preserve">Chennai, India (open to relocation worldwide)  •  irulandi.madhan@gmail.com  •  </w:t>
       </w:r>
-      <w:hyperlink w:history="1" r:id="rIdv8jwz2sh18o3jdpan0bwl">
+      <w:hyperlink w:history="1" r:id="rIdhbuuxcutqxbnxrwhhrjia">
         <w:r>
           <w:rPr>
             <w:rFonts w:ascii="Calibri" w:cs="Calibri" w:eastAsia="Calibri" w:hAnsi="Calibri"/>
@@ -72,7 +72,7 @@
         </w:rPr>
         <w:t xml:space="preserve">  •  </w:t>
       </w:r>
-      <w:hyperlink w:history="1" r:id="rIdpdd6cvkylnarqslcgsb2m">
+      <w:hyperlink w:history="1" r:id="rIdmfnkpaaauspgtkvs2p57v">
         <w:r>
           <w:rPr>
             <w:rFonts w:ascii="Calibri" w:cs="Calibri" w:eastAsia="Calibri" w:hAnsi="Calibri"/>
@@ -363,7 +363,7 @@
           <w:sz w:val="20"/>
           <w:szCs w:val="20"/>
         </w:rPr>
-        <w:t xml:space="preserve">Generative AI &amp; RAG, Azure AI, AKS, Apigee (JWT, OAuth 2.0), GitLab, Jenkins, OpenText xPression &amp; Exstream, AWD</w:t>
+        <w:t xml:space="preserve">Generative AI &amp; RAG, Azure AI, AKS, Apigee (JWT, OAuth 2.0), GitLab, Jenkins, OpenText xPression &amp; Exstream, SS&amp;C Chorus BPM (AWD)</w:t>
       </w:r>
     </w:p>
     <w:p>
@@ -716,7 +716,7 @@
           <w:sz w:val="19"/>
           <w:szCs w:val="19"/>
         </w:rPr>
-        <w:t xml:space="preserve"> · AWD workflow platform modernisation</w:t>
+        <w:t xml:space="preserve"> · AWD to SS&amp;C Chorus BPM modernisation</w:t>
       </w:r>
     </w:p>
     <w:p>
@@ -796,7 +796,27 @@
           <w:sz w:val="20"/>
           <w:szCs w:val="20"/>
         </w:rPr>
-        <w:t xml:space="preserve">Upgraded the AWD workflow system for the first time since 2019, finishing most of the work by Q2 2023, within a year of taking over.</w:t>
+        <w:t xml:space="preserve">Delivered the AWD workflow platform's first upgrades since its 2019 release, finishing most of the work by Q2 2023, within a year of taking over.</w:t>
+      </w:r>
+    </w:p>
+    <w:p>
+      <w:pPr>
+        <w:pStyle w:val="ListParagraph"/>
+        <w:numPr>
+          <w:ilvl w:val="0"/>
+          <w:numId w:val="2"/>
+        </w:numPr>
+        <w:spacing w:after="30" w:line="252"/>
+        <w:jc w:val="both"/>
+      </w:pPr>
+      <w:r>
+        <w:rPr>
+          <w:rFonts w:ascii="Calibri" w:cs="Calibri" w:eastAsia="Calibri" w:hAnsi="Calibri"/>
+          <w:color w:val="2B3A4F"/>
+          <w:sz w:val="20"/>
+          <w:szCs w:val="20"/>
+        </w:rPr>
+        <w:t xml:space="preserve">Moved all my teams off AWD's legacy EnCorr and Viewstation desktops onto SS&amp;C Chorus BPM, its current generation, before handing over in Aug 2025.</w:t>
       </w:r>
     </w:p>
     <w:p>

</xml_diff>

<commit_message>
Resume: US spelling and mainframe skills (z/OS, COBOL, JCL, DB2, CICS, VSAM, Control-M, CA-7).
Co-Authored-By: Claude Opus 5.5 <noreply@anthropic.com>
Claude-Session: https://claude.ai/code/session_01MFRrTt7LBDdX57m85KHNGp
</commit_message>
<xml_diff>
--- a/assets/resume/Madhan-Irulandi-Resume.docx
+++ b/assets/resume/Madhan-Irulandi-Resume.docx
@@ -51,7 +51,7 @@
         </w:rPr>
         <w:t xml:space="preserve">Chennai, India (open to relocation worldwide)  •  irulandi.madhan@gmail.com  •  </w:t>
       </w:r>
-      <w:hyperlink w:history="1" r:id="rIdhbuuxcutqxbnxrwhhrjia">
+      <w:hyperlink w:history="1" r:id="rIdk9r7isbona7qlbxqfrjjz">
         <w:r>
           <w:rPr>
             <w:rFonts w:ascii="Calibri" w:cs="Calibri" w:eastAsia="Calibri" w:hAnsi="Calibri"/>
@@ -72,7 +72,7 @@
         </w:rPr>
         <w:t xml:space="preserve">  •  </w:t>
       </w:r>
-      <w:hyperlink w:history="1" r:id="rIdmfnkpaaauspgtkvs2p57v">
+      <w:hyperlink w:history="1" r:id="rIdeli2prmf1uuzu4rxes8sx">
         <w:r>
           <w:rPr>
             <w:rFonts w:ascii="Calibri" w:cs="Calibri" w:eastAsia="Calibri" w:hAnsi="Calibri"/>
@@ -116,7 +116,7 @@
           <w:sz w:val="20"/>
           <w:szCs w:val="20"/>
         </w:rPr>
-        <w:t xml:space="preserve">Over 13 years, I've grown from production support to leading delivery for retail, insurance and healthcare leaders like Walmart, MetLife, Manulife, Allstate, Anthem and John Hancock. In insurance alone, the systems I've delivered serve more than 20 million policyholders. Today I run Agile Release Trains on AI-enabled platforms and restart stalled programmes. A Microsoft Certified Trainer since 2020, I've trained 3,000+ people and given 75+ guest lectures.</w:t>
+        <w:t xml:space="preserve">Over 13 years, I've grown from production support to leading delivery for retail, insurance and healthcare leaders like Walmart, MetLife, Manulife, Allstate, Anthem and John Hancock. In insurance alone, the systems I've delivered serve more than 20 million policyholders. Today I run Agile Release Trains on AI-enabled platforms and restart stalled programs. A Microsoft Certified Trainer since 2020, I've trained 3,000+ people and given 75+ guest lectures.</w:t>
       </w:r>
     </w:p>
     <w:p>
@@ -147,7 +147,7 @@
           <w:sz w:val="20"/>
           <w:szCs w:val="20"/>
         </w:rPr>
-        <w:t xml:space="preserve">Restarted a multi-million-dollar John Hancock platform stalled two years by COVID, clearing 400+ backlog tickets in 9 months and taking all 5 modernisation initiatives live across 20+ business divisions.</w:t>
+        <w:t xml:space="preserve">Restarted a multi-million-dollar John Hancock platform stalled two years by COVID, clearing 400+ backlog tickets in 9 months and taking all 5 modernization initiatives live across 20+ business divisions.</w:t>
       </w:r>
     </w:p>
     <w:p>
@@ -364,6 +364,32 @@
           <w:szCs w:val="20"/>
         </w:rPr>
         <w:t xml:space="preserve">Generative AI &amp; RAG, Azure AI, AKS, Apigee (JWT, OAuth 2.0), GitLab, Jenkins, OpenText xPression &amp; Exstream, SS&amp;C Chorus BPM (AWD)</w:t>
+      </w:r>
+    </w:p>
+    <w:p>
+      <w:pPr>
+        <w:spacing w:after="30" w:before="0" w:line="252"/>
+        <w:jc w:val="both"/>
+      </w:pPr>
+      <w:r>
+        <w:rPr>
+          <w:rFonts w:ascii="Calibri" w:cs="Calibri" w:eastAsia="Calibri" w:hAnsi="Calibri"/>
+          <w:b/>
+          <w:bCs/>
+          <w:color w:val="0B2545"/>
+          <w:sz w:val="20"/>
+          <w:szCs w:val="20"/>
+        </w:rPr>
+        <w:t xml:space="preserve">Mainframe: </w:t>
+      </w:r>
+      <w:r>
+        <w:rPr>
+          <w:rFonts w:ascii="Calibri" w:cs="Calibri" w:eastAsia="Calibri" w:hAnsi="Calibri"/>
+          <w:color w:val="2B3A4F"/>
+          <w:sz w:val="20"/>
+          <w:szCs w:val="20"/>
+        </w:rPr>
+        <w:t xml:space="preserve">z/OS, COBOL, JCL, DB2, CICS, VSAM, Control-M, CA-7</w:t>
       </w:r>
     </w:p>
     <w:p>
@@ -716,27 +742,27 @@
           <w:sz w:val="19"/>
           <w:szCs w:val="19"/>
         </w:rPr>
-        <w:t xml:space="preserve"> · AWD to SS&amp;C Chorus BPM modernisation</w:t>
-      </w:r>
-    </w:p>
-    <w:p>
-      <w:pPr>
-        <w:pStyle w:val="ListParagraph"/>
-        <w:numPr>
-          <w:ilvl w:val="0"/>
-          <w:numId w:val="2"/>
-        </w:numPr>
-        <w:spacing w:after="30" w:line="252"/>
-        <w:jc w:val="both"/>
-      </w:pPr>
-      <w:r>
-        <w:rPr>
-          <w:rFonts w:ascii="Calibri" w:cs="Calibri" w:eastAsia="Calibri" w:hAnsi="Calibri"/>
-          <w:color w:val="2B3A4F"/>
-          <w:sz w:val="20"/>
-          <w:szCs w:val="20"/>
-        </w:rPr>
-        <w:t xml:space="preserve">Restarted a multi-million-dollar platform programme stalled for two years by COVID, rebuilding the release process and clearing 400+ backlog tickets in 9 months.</w:t>
+        <w:t xml:space="preserve"> · AWD to SS&amp;C Chorus BPM modernization</w:t>
+      </w:r>
+    </w:p>
+    <w:p>
+      <w:pPr>
+        <w:pStyle w:val="ListParagraph"/>
+        <w:numPr>
+          <w:ilvl w:val="0"/>
+          <w:numId w:val="2"/>
+        </w:numPr>
+        <w:spacing w:after="30" w:line="252"/>
+        <w:jc w:val="both"/>
+      </w:pPr>
+      <w:r>
+        <w:rPr>
+          <w:rFonts w:ascii="Calibri" w:cs="Calibri" w:eastAsia="Calibri" w:hAnsi="Calibri"/>
+          <w:color w:val="2B3A4F"/>
+          <w:sz w:val="20"/>
+          <w:szCs w:val="20"/>
+        </w:rPr>
+        <w:t xml:space="preserve">Restarted a multi-million-dollar platform program stalled for two years by COVID, rebuilding the release process and clearing 400+ backlog tickets in 9 months.</w:t>
       </w:r>
     </w:p>
     <w:p>
@@ -776,7 +802,7 @@
           <w:sz w:val="20"/>
           <w:szCs w:val="20"/>
         </w:rPr>
-        <w:t xml:space="preserve">Took all 5 modernisation initiatives live across 20+ business divisions by guiding teams through coordinated upgrades.</w:t>
+        <w:t xml:space="preserve">Took all 5 modernization initiatives live across 20+ business divisions by guiding teams through coordinated upgrades.</w:t>
       </w:r>
     </w:p>
     <w:p>
@@ -946,7 +972,7 @@
           <w:sz w:val="20"/>
           <w:szCs w:val="20"/>
         </w:rPr>
-        <w:t xml:space="preserve">Cut programme cost 25% by streamlining the SDLC, without hiring, and raised team velocity 30% through hands-on Agile coaching.</w:t>
+        <w:t xml:space="preserve">Cut program cost 25% by streamlining the SDLC, without hiring, and raised team velocity 30% through hands-on Agile coaching.</w:t>
       </w:r>
     </w:p>
     <w:p>
@@ -1239,7 +1265,7 @@
           <w:sz w:val="20"/>
           <w:szCs w:val="20"/>
         </w:rPr>
-        <w:t xml:space="preserve">Resolved 50+ critical P1/P2 outages and 120 high-priority incidents, and automated competitive reporting in the Order Management System, saving 25 hours of manual work a week.</w:t>
+        <w:t xml:space="preserve">Resolved 50+ critical P1/P2 outages and 120 high-priority incidents, and automated competitive reporting in the Order Management System, saving 25 hours of manual work a week, on a mainframe stack (z/OS, COBOL, JCL, DB2, CICS, VSAM, Control-M, CA-7).</w:t>
       </w:r>
     </w:p>
     <w:p>

</xml_diff>

<commit_message>
Remove Control-M from skills, Walmart bullet and resume.
Co-Authored-By: Claude Opus 5.5 <noreply@anthropic.com>
Claude-Session: https://claude.ai/code/session_01MFRrTt7LBDdX57m85KHNGp
</commit_message>
<xml_diff>
--- a/assets/resume/Madhan-Irulandi-Resume.docx
+++ b/assets/resume/Madhan-Irulandi-Resume.docx
@@ -51,7 +51,7 @@
         </w:rPr>
         <w:t xml:space="preserve">Chennai, India (open to relocation worldwide)  •  irulandi.madhan@gmail.com  •  </w:t>
       </w:r>
-      <w:hyperlink w:history="1" r:id="rIdk9r7isbona7qlbxqfrjjz">
+      <w:hyperlink w:history="1" r:id="rIdcr6f-eg3qls71gl6kaqsh">
         <w:r>
           <w:rPr>
             <w:rFonts w:ascii="Calibri" w:cs="Calibri" w:eastAsia="Calibri" w:hAnsi="Calibri"/>
@@ -72,7 +72,7 @@
         </w:rPr>
         <w:t xml:space="preserve">  •  </w:t>
       </w:r>
-      <w:hyperlink w:history="1" r:id="rIdeli2prmf1uuzu4rxes8sx">
+      <w:hyperlink w:history="1" r:id="rIdfdhjx41eo6qvruwnexexm">
         <w:r>
           <w:rPr>
             <w:rFonts w:ascii="Calibri" w:cs="Calibri" w:eastAsia="Calibri" w:hAnsi="Calibri"/>
@@ -116,7 +116,7 @@
           <w:sz w:val="20"/>
           <w:szCs w:val="20"/>
         </w:rPr>
-        <w:t xml:space="preserve">Over 13 years, I've grown from production support to leading delivery for retail, insurance and healthcare leaders like Walmart, MetLife, Manulife, Allstate, Anthem and John Hancock. In insurance alone, the systems I've delivered serve more than 20 million policyholders. Today I run Agile Release Trains on AI-enabled platforms and restart stalled programs. A Microsoft Certified Trainer since 2020, I've trained 3,000+ people and given 75+ guest lectures.</w:t>
+        <w:t xml:space="preserve">Over 13 years, I've grown from production support to leading delivery for retail, insurance and healthcare leaders like Walmart, MetLife, Manulife, Allstate, Anthem and John Hancock. In insurance alone, the systems I've delivered serve more than 20 million policyholders. Today I run Agile Release Trains on AI-enabled platforms and restart at-risk programs. A Microsoft Certified Trainer since 2020, I've trained 3,000+ people and given 75+ guest lectures.</w:t>
       </w:r>
     </w:p>
     <w:p>
@@ -389,7 +389,7 @@
           <w:sz w:val="20"/>
           <w:szCs w:val="20"/>
         </w:rPr>
-        <w:t xml:space="preserve">z/OS, COBOL, JCL, DB2, CICS, VSAM, Control-M, CA-7</w:t>
+        <w:t xml:space="preserve">z/OS, COBOL, JCL, DB2, CICS, VSAM, CA-7</w:t>
       </w:r>
     </w:p>
     <w:p>
@@ -1265,7 +1265,7 @@
           <w:sz w:val="20"/>
           <w:szCs w:val="20"/>
         </w:rPr>
-        <w:t xml:space="preserve">Resolved 50+ critical P1/P2 outages and 120 high-priority incidents, and automated competitive reporting in the Order Management System, saving 25 hours of manual work a week, on a mainframe stack (z/OS, COBOL, JCL, DB2, CICS, VSAM, Control-M, CA-7).</w:t>
+        <w:t xml:space="preserve">Resolved 50+ critical P1/P2 outages and 120 high-priority incidents, and automated competitive reporting in the Order Management System, saving 25 hours of manual work a week, on a mainframe stack (z/OS, COBOL, JCL, DB2, CICS, VSAM, CA-7).</w:t>
       </w:r>
     </w:p>
     <w:p>

</xml_diff>

<commit_message>
Resume rebuilt from the site: summary wording, training line, client feedback, GitLab Git Associate
Co-Authored-By: Claude Opus 5.5 <noreply@anthropic.com>
Claude-Session: https://claude.ai/code/session_01MFRrTt7LBDdX57m85KHNGp
</commit_message>
<xml_diff>
--- a/assets/resume/Madhan-Irulandi-Resume.docx
+++ b/assets/resume/Madhan-Irulandi-Resume.docx
@@ -51,7 +51,7 @@
         </w:rPr>
         <w:t xml:space="preserve">Chennai, India (open to relocation worldwide)  •  irulandi.madhan@gmail.com  •  </w:t>
       </w:r>
-      <w:hyperlink w:history="1" r:id="rIdcr6f-eg3qls71gl6kaqsh">
+      <w:hyperlink w:history="1" r:id="rId8m01dururq79pdaxzrhhm">
         <w:r>
           <w:rPr>
             <w:rFonts w:ascii="Calibri" w:cs="Calibri" w:eastAsia="Calibri" w:hAnsi="Calibri"/>
@@ -72,7 +72,7 @@
         </w:rPr>
         <w:t xml:space="preserve">  •  </w:t>
       </w:r>
-      <w:hyperlink w:history="1" r:id="rIdfdhjx41eo6qvruwnexexm">
+      <w:hyperlink w:history="1" r:id="rIdlwdu1e3fjfve-8ek0jxp3">
         <w:r>
           <w:rPr>
             <w:rFonts w:ascii="Calibri" w:cs="Calibri" w:eastAsia="Calibri" w:hAnsi="Calibri"/>
@@ -116,7 +116,7 @@
           <w:sz w:val="20"/>
           <w:szCs w:val="20"/>
         </w:rPr>
-        <w:t xml:space="preserve">Over 13 years, I've grown from production support to leading delivery for retail, insurance and healthcare leaders like Walmart, MetLife, Manulife, Allstate, Anthem and John Hancock. In insurance alone, the systems I've delivered serve more than 20 million policyholders. Today I run Agile Release Trains on AI-enabled platforms and restart at-risk programs. A Microsoft Certified Trainer since 2020, I've trained 3,000+ people and given 75+ guest lectures.</w:t>
+        <w:t xml:space="preserve">Over 13 years, I've grown from production support to leading delivery for retail, insurance and healthcare leaders like Walmart, MetLife, Manulife, Allstate, Anthem and John Hancock. In insurance alone, the systems I've delivered serve more than 20 million policyholders. Today I run Agile Release Trains on AI-enabled platforms and turn around at-risk programs. A Microsoft Certified Trainer since 2020, I've trained 3,000+ people and given 75+ guest lectures.</w:t>
       </w:r>
     </w:p>
     <w:p>
@@ -1468,7 +1468,7 @@
           <w:sz w:val="20"/>
           <w:szCs w:val="20"/>
         </w:rPr>
-        <w:t xml:space="preserve">GitLab Certified CI/CD Associate  •  Certified Jenkins Engineer  •  PagerDuty Incident Management  •  80+ in total, listed on madhanirulandi.com</w:t>
+        <w:t xml:space="preserve">GitLab Certified CI/CD Associate  •  GitLab Certified Git Associate  •  Certified Jenkins Engineer (CloudBees)  •  PagerDuty Incident Management  •  80+ in total, listed on madhanirulandi.com</w:t>
       </w:r>
     </w:p>
     <w:p>
@@ -1617,7 +1617,69 @@
           <w:sz w:val="22"/>
           <w:szCs w:val="22"/>
         </w:rPr>
-        <w:t xml:space="preserve">RECOGNITION, SPEAKING &amp; COMMUNITY</w:t>
+        <w:t xml:space="preserve">TRAINING, RECOGNITION &amp; COMMUNITY</w:t>
+      </w:r>
+    </w:p>
+    <w:p>
+      <w:pPr>
+        <w:pStyle w:val="ListParagraph"/>
+        <w:numPr>
+          <w:ilvl w:val="0"/>
+          <w:numId w:val="2"/>
+        </w:numPr>
+        <w:spacing w:after="30" w:line="252"/>
+        <w:jc w:val="both"/>
+      </w:pPr>
+      <w:r>
+        <w:rPr>
+          <w:rFonts w:ascii="Calibri" w:cs="Calibri" w:eastAsia="Calibri" w:hAnsi="Calibri"/>
+          <w:b/>
+          <w:bCs/>
+          <w:color w:val="0B2545"/>
+          <w:sz w:val="20"/>
+          <w:szCs w:val="20"/>
+        </w:rPr>
+        <w:t xml:space="preserve">Training: </w:t>
+      </w:r>
+      <w:r>
+        <w:rPr>
+          <w:rFonts w:ascii="Calibri" w:cs="Calibri" w:eastAsia="Calibri" w:hAnsi="Calibri"/>
+          <w:color w:val="2B3A4F"/>
+          <w:sz w:val="20"/>
+          <w:szCs w:val="20"/>
+        </w:rPr>
+        <w:t xml:space="preserve">Microsoft Certified Trainer every year since 2020, teaching SAFe® practice (SM &amp; POPM; not official Scaled Agile courses), Scrum &amp; Kanban, Azure AI-102, AZ-104, AZ-900/AI-900/DP-900 and AWS &amp; Google Cloud fundamentals to corporate teams, graduates and colleges.</w:t>
+      </w:r>
+    </w:p>
+    <w:p>
+      <w:pPr>
+        <w:pStyle w:val="ListParagraph"/>
+        <w:numPr>
+          <w:ilvl w:val="0"/>
+          <w:numId w:val="2"/>
+        </w:numPr>
+        <w:spacing w:after="30" w:line="252"/>
+        <w:jc w:val="both"/>
+      </w:pPr>
+      <w:r>
+        <w:rPr>
+          <w:rFonts w:ascii="Calibri" w:cs="Calibri" w:eastAsia="Calibri" w:hAnsi="Calibri"/>
+          <w:b/>
+          <w:bCs/>
+          <w:color w:val="0B2545"/>
+          <w:sz w:val="20"/>
+          <w:szCs w:val="20"/>
+        </w:rPr>
+        <w:t xml:space="preserve">Client feedback: </w:t>
+      </w:r>
+      <w:r>
+        <w:rPr>
+          <w:rFonts w:ascii="Calibri" w:cs="Calibri" w:eastAsia="Calibri" w:hAnsi="Calibri"/>
+          <w:color w:val="2B3A4F"/>
+          <w:sz w:val="20"/>
+          <w:szCs w:val="20"/>
+        </w:rPr>
+        <w:t xml:space="preserve">“Overall, your professionalism, organizational skills, and commitment to agile excellence make a real difference to our delivery and team confidence.” (Client Project Manager, insurance client, Sep 2025 – Apr 2026). Thanked by name in release announcements on 15 Jan, 2 Feb, 12 Feb and 24 Mar 2026.</w:t>
       </w:r>
     </w:p>
     <w:p>
@@ -1710,7 +1772,7 @@
           <w:sz w:val="20"/>
           <w:szCs w:val="20"/>
         </w:rPr>
-        <w:t xml:space="preserve">Volunteer member on the non-technical side (Sep 2022 – Aug 2025), helping newcomers set up cloud accounts and tools on four projects: MAPLE, the Urban League Heat Pump Accelerator, the National Police Data Coalition and HEAT.</w:t>
+        <w:t xml:space="preserve">Volunteer member on the non-technical side (Sep 2022 – Aug 2025), helping newcomers get set up on MAPLE, Urban League Heat Pump Accelerator, National Police Data Coalition and HEAT.</w:t>
       </w:r>
     </w:p>
     <w:sectPr>

</xml_diff>

<commit_message>
Resume: 2 strongest points for Allstate and TruStage, one each for Cognizant clients and Dell, freelance noted, no ITIL, certifications in 3 rows
Co-Authored-By: Claude Opus 5.5 <noreply@anthropic.com>
Claude-Session: https://claude.ai/code/session_01MFRrTt7LBDdX57m85KHNGp
</commit_message>
<xml_diff>
--- a/assets/resume/Madhan-Irulandi-Resume.docx
+++ b/assets/resume/Madhan-Irulandi-Resume.docx
@@ -51,7 +51,7 @@
         </w:rPr>
         <w:t xml:space="preserve">Chennai, India (open to relocation worldwide)  •  irulandi.madhan@gmail.com  •  </w:t>
       </w:r>
-      <w:hyperlink w:history="1" r:id="rId8m01dururq79pdaxzrhhm">
+      <w:hyperlink w:history="1" r:id="rIdbac1cfnbyu97ivorixu1o">
         <w:r>
           <w:rPr>
             <w:rFonts w:ascii="Calibri" w:cs="Calibri" w:eastAsia="Calibri" w:hAnsi="Calibri"/>
@@ -72,7 +72,7 @@
         </w:rPr>
         <w:t xml:space="preserve">  •  </w:t>
       </w:r>
-      <w:hyperlink w:history="1" r:id="rIdlwdu1e3fjfve-8ek0jxp3">
+      <w:hyperlink w:history="1" r:id="rIdbra-fuqr9ectqjtvs7ann">
         <w:r>
           <w:rPr>
             <w:rFonts w:ascii="Calibri" w:cs="Calibri" w:eastAsia="Calibri" w:hAnsi="Calibri"/>
@@ -932,27 +932,7 @@
           <w:sz w:val="20"/>
           <w:szCs w:val="20"/>
         </w:rPr>
-        <w:t xml:space="preserve">Reached 20M+ Allstate and 400K Encompass Insurance policyholders with customer communications by deploying 750+ document templates.</w:t>
-      </w:r>
-    </w:p>
-    <w:p>
-      <w:pPr>
-        <w:pStyle w:val="ListParagraph"/>
-        <w:numPr>
-          <w:ilvl w:val="0"/>
-          <w:numId w:val="2"/>
-        </w:numPr>
-        <w:spacing w:after="30" w:line="252"/>
-        <w:jc w:val="both"/>
-      </w:pPr>
-      <w:r>
-        <w:rPr>
-          <w:rFonts w:ascii="Calibri" w:cs="Calibri" w:eastAsia="Calibri" w:hAnsi="Calibri"/>
-          <w:color w:val="2B3A4F"/>
-          <w:sz w:val="20"/>
-          <w:szCs w:val="20"/>
-        </w:rPr>
-        <w:t xml:space="preserve">Moved production deployments from monthly to near-weekly by clearing blockers as the main escalation point between engineering and client executives.</w:t>
+        <w:t xml:space="preserve">Moved production deployments from monthly to near-weekly by clearing blockers as the main escalation point between engineering and client executives, reaching 20M+ Allstate and 400K Encompass policyholders.</w:t>
       </w:r>
     </w:p>
     <w:p>
@@ -1098,26 +1078,6 @@
     </w:p>
     <w:p>
       <w:pPr>
-        <w:pStyle w:val="ListParagraph"/>
-        <w:numPr>
-          <w:ilvl w:val="0"/>
-          <w:numId w:val="2"/>
-        </w:numPr>
-        <w:spacing w:after="30" w:line="252"/>
-        <w:jc w:val="both"/>
-      </w:pPr>
-      <w:r>
-        <w:rPr>
-          <w:rFonts w:ascii="Calibri" w:cs="Calibri" w:eastAsia="Calibri" w:hAnsi="Calibri"/>
-          <w:color w:val="2B3A4F"/>
-          <w:sz w:val="20"/>
-          <w:szCs w:val="20"/>
-        </w:rPr>
-        <w:t xml:space="preserve">Shortened project schedules 35% by mentoring onsite and offshore engineers and running sprint retrospectives.</w:t>
-      </w:r>
-    </w:p>
-    <w:p>
-      <w:pPr>
         <w:keepNext/>
         <w:tabs>
           <w:tab w:val="right" w:pos="10466"/>
@@ -1234,7 +1194,7 @@
           <w:sz w:val="20"/>
           <w:szCs w:val="20"/>
         </w:rPr>
-        <w:t xml:space="preserve">Consolidated legacy layouts into dynamic master templates, saving $300K a year, and decreased post-implementation defects 25% with automated pre-flight QA checklists.</w:t>
+        <w:t xml:space="preserve">Consolidated legacy layouts into dynamic master templates with OpenText Exstream and xPression, saving $300K a year in operating costs.</w:t>
       </w:r>
     </w:p>
     <w:p>
@@ -1265,7 +1225,7 @@
           <w:sz w:val="20"/>
           <w:szCs w:val="20"/>
         </w:rPr>
-        <w:t xml:space="preserve">Resolved 50+ critical P1/P2 outages and 120 high-priority incidents, and automated competitive reporting in the Order Management System, saving 25 hours of manual work a week, on a mainframe stack (z/OS, COBOL, JCL, DB2, CICS, VSAM, CA-7).</w:t>
+        <w:t xml:space="preserve">Resolved 50+ critical P1/P2 outages and 120 high-priority incidents through peak retail periods on the mainframe Order Management System (z/OS, COBOL, JCL, DB2, CICS, VSAM, CA-7).</w:t>
       </w:r>
     </w:p>
     <w:p>
@@ -1327,7 +1287,7 @@
           <w:sz w:val="20"/>
           <w:szCs w:val="20"/>
         </w:rPr>
-        <w:t xml:space="preserve">Headed a 15-member team as acting Operations Project Lead, recovering more than $150K a quarter in payment discrepancies and adding over $100K a month to collections.</w:t>
+        <w:t xml:space="preserve">Headed a 15-member team as acting Operations Project Lead, recovering more than $150K a quarter by settling high-value payment discrepancies.</w:t>
       </w:r>
     </w:p>
     <w:p>
@@ -1389,7 +1349,7 @@
           <w:sz w:val="20"/>
           <w:szCs w:val="20"/>
         </w:rPr>
-        <w:t xml:space="preserve">Ran a 40-strong VIP hospitality crew at Chepauk during the IPL and drove Chennai promotions for India's first Formula 1 Grand Prix (2011), before moving into IT in 2013.</w:t>
+        <w:t xml:space="preserve">Part-time freelance work: ran a 40-strong VIP hospitality crew at Chepauk during the IPL and drove Chennai promotions for India's first Formula 1 Grand Prix (2011), before moving into IT in 2013.</w:t>
       </w:r>
     </w:p>
     <w:p>
@@ -1428,47 +1388,47 @@
           <w:sz w:val="20"/>
           <w:szCs w:val="20"/>
         </w:rPr>
-        <w:t xml:space="preserve">Certified SAFe® 6 Scrum Master  •  SAFe® 6 Product Owner / Product Manager (POPM)  •  ITIL® Foundation (EXIN)</w:t>
-      </w:r>
-    </w:p>
-    <w:p>
-      <w:pPr>
-        <w:pStyle w:val="ListParagraph"/>
-        <w:numPr>
-          <w:ilvl w:val="0"/>
-          <w:numId w:val="2"/>
-        </w:numPr>
-        <w:spacing w:after="30" w:line="252"/>
-        <w:jc w:val="both"/>
-      </w:pPr>
-      <w:r>
-        <w:rPr>
-          <w:rFonts w:ascii="Calibri" w:cs="Calibri" w:eastAsia="Calibri" w:hAnsi="Calibri"/>
-          <w:color w:val="2B3A4F"/>
-          <w:sz w:val="20"/>
-          <w:szCs w:val="20"/>
-        </w:rPr>
-        <w:t xml:space="preserve">Microsoft Certified Trainer (since 2020)  •  Azure AI Engineer Associate  •  Azure Administrator Associate</w:t>
-      </w:r>
-    </w:p>
-    <w:p>
-      <w:pPr>
-        <w:pStyle w:val="ListParagraph"/>
-        <w:numPr>
-          <w:ilvl w:val="0"/>
-          <w:numId w:val="2"/>
-        </w:numPr>
-        <w:spacing w:after="30" w:line="252"/>
-        <w:jc w:val="both"/>
-      </w:pPr>
-      <w:r>
-        <w:rPr>
-          <w:rFonts w:ascii="Calibri" w:cs="Calibri" w:eastAsia="Calibri" w:hAnsi="Calibri"/>
-          <w:color w:val="2B3A4F"/>
-          <w:sz w:val="20"/>
-          <w:szCs w:val="20"/>
-        </w:rPr>
-        <w:t xml:space="preserve">GitLab Certified CI/CD Associate  •  GitLab Certified Git Associate  •  Certified Jenkins Engineer (CloudBees)  •  PagerDuty Incident Management  •  80+ in total, listed on madhanirulandi.com</w:t>
+        <w:t xml:space="preserve">Certified SAFe® 6 Scrum Master  •  Certified SAFe® 6 Product Owner / Product Manager  •  Microsoft Certified Trainer</w:t>
+      </w:r>
+    </w:p>
+    <w:p>
+      <w:pPr>
+        <w:pStyle w:val="ListParagraph"/>
+        <w:numPr>
+          <w:ilvl w:val="0"/>
+          <w:numId w:val="2"/>
+        </w:numPr>
+        <w:spacing w:after="30" w:line="252"/>
+        <w:jc w:val="both"/>
+      </w:pPr>
+      <w:r>
+        <w:rPr>
+          <w:rFonts w:ascii="Calibri" w:cs="Calibri" w:eastAsia="Calibri" w:hAnsi="Calibri"/>
+          <w:color w:val="2B3A4F"/>
+          <w:sz w:val="20"/>
+          <w:szCs w:val="20"/>
+        </w:rPr>
+        <w:t xml:space="preserve">Microsoft Azure AI Engineer Associate  •  Microsoft Azure Administrator Associate  •  GitLab Certified CI/CD Associate</w:t>
+      </w:r>
+    </w:p>
+    <w:p>
+      <w:pPr>
+        <w:pStyle w:val="ListParagraph"/>
+        <w:numPr>
+          <w:ilvl w:val="0"/>
+          <w:numId w:val="2"/>
+        </w:numPr>
+        <w:spacing w:after="30" w:line="252"/>
+        <w:jc w:val="both"/>
+      </w:pPr>
+      <w:r>
+        <w:rPr>
+          <w:rFonts w:ascii="Calibri" w:cs="Calibri" w:eastAsia="Calibri" w:hAnsi="Calibri"/>
+          <w:color w:val="2B3A4F"/>
+          <w:sz w:val="20"/>
+          <w:szCs w:val="20"/>
+        </w:rPr>
+        <w:t xml:space="preserve">GitLab Certified Git Associate  •  Certified Jenkins Engineer  •  PagerDuty Incident Management  •  80+ in total</w:t>
       </w:r>
     </w:p>
     <w:p>

</xml_diff>

<commit_message>
Resume: 7-team, 40-person ART across 3 products; predictability held since Sep 2025
Co-Authored-By: Claude Opus 5.5 <noreply@anthropic.com>
Claude-Session: https://claude.ai/code/session_01MFRrTt7LBDdX57m85KHNGp
</commit_message>
<xml_diff>
--- a/assets/resume/Madhan-Irulandi-Resume.docx
+++ b/assets/resume/Madhan-Irulandi-Resume.docx
@@ -51,7 +51,7 @@
         </w:rPr>
         <w:t xml:space="preserve">Chennai, India (open to relocation worldwide)  •  irulandi.madhan@gmail.com  •  </w:t>
       </w:r>
-      <w:hyperlink w:history="1" r:id="rIdbac1cfnbyu97ivorixu1o">
+      <w:hyperlink w:history="1" r:id="rIddw96v1mi_zgdoaisuqvgp">
         <w:r>
           <w:rPr>
             <w:rFonts w:ascii="Calibri" w:cs="Calibri" w:eastAsia="Calibri" w:hAnsi="Calibri"/>
@@ -72,7 +72,7 @@
         </w:rPr>
         <w:t xml:space="preserve">  •  </w:t>
       </w:r>
-      <w:hyperlink w:history="1" r:id="rIdbra-fuqr9ectqjtvs7ann">
+      <w:hyperlink w:history="1" r:id="rIddozwo2gfgfii5gj2r4h_r">
         <w:r>
           <w:rPr>
             <w:rFonts w:ascii="Calibri" w:cs="Calibri" w:eastAsia="Calibri" w:hAnsi="Calibri"/>
@@ -116,7 +116,7 @@
           <w:sz w:val="20"/>
           <w:szCs w:val="20"/>
         </w:rPr>
-        <w:t xml:space="preserve">Over 13 years, I've grown from production support to leading delivery for retail, insurance and healthcare leaders like Walmart, MetLife, Manulife, Allstate, Anthem and John Hancock. In insurance alone, the systems I've delivered serve more than 20 million policyholders. Today I run Agile Release Trains on AI-enabled platforms and turn around at-risk programs. A Microsoft Certified Trainer since 2020, I've trained 3,000+ people and given 75+ guest lectures.</w:t>
+        <w:t xml:space="preserve">Over 13 years, I've grown from production support to leading delivery for retail, insurance and healthcare leaders like Walmart, MetLife, Manulife, Allstate, Anthem and John Hancock. In insurance alone, the systems I've delivered serve more than 20 million policyholders. Today I run a 7-team, 40-person Agile Release Train across three AI-enabled products and turn around at-risk programs. A Microsoft Certified Trainer since 2020, I've trained 3,000+ people and given 75+ guest lectures.</w:t>
       </w:r>
     </w:p>
     <w:p>
@@ -178,7 +178,7 @@
           <w:sz w:val="20"/>
           <w:szCs w:val="20"/>
         </w:rPr>
-        <w:t xml:space="preserve">Delivered 100% of planned work every planning cycle on Manulife's release train, with under 5% sprint variance and zero critical security issues.</w:t>
+        <w:t xml:space="preserve">Delivered 100% of planned work in every planning cycle since taking over Manulife's 7-team, 40-person release train in Sep 2025, with under 5% sprint variance and zero critical security issues.</w:t>
       </w:r>
     </w:p>
     <w:p>
@@ -672,7 +672,7 @@
           <w:sz w:val="20"/>
           <w:szCs w:val="20"/>
         </w:rPr>
-        <w:t xml:space="preserve">Lead end-to-end governance for Manulife's Core API, Customer Engagement and Compliance AI products, reporting progress and roadmap decisions to executive leadership.</w:t>
+        <w:t xml:space="preserve">Run a 7-team, 40-person release train across Manulife's Core API, Customer Engagement and Compliance AI products, leading end-to-end governance and reporting progress and roadmap decisions to executive leadership.</w:t>
       </w:r>
     </w:p>
     <w:p>

</xml_diff>

<commit_message>
Show portfolio scope in Manulife and John Hancock bullets; rebuild resume
Co-Authored-By: Claude Opus 5.5 <noreply@anthropic.com>
Claude-Session: https://claude.ai/code/session_01MFRrTt7LBDdX57m85KHNGp
</commit_message>
<xml_diff>
--- a/assets/resume/Madhan-Irulandi-Resume.docx
+++ b/assets/resume/Madhan-Irulandi-Resume.docx
@@ -51,7 +51,7 @@
         </w:rPr>
         <w:t xml:space="preserve">Chennai, India (open to relocation worldwide)  •  irulandi.madhan@gmail.com  •  </w:t>
       </w:r>
-      <w:hyperlink w:history="1" r:id="rIddw96v1mi_zgdoaisuqvgp">
+      <w:hyperlink w:history="1" r:id="rIdqxw77mn9uwo-nqbjmibgf">
         <w:r>
           <w:rPr>
             <w:rFonts w:ascii="Calibri" w:cs="Calibri" w:eastAsia="Calibri" w:hAnsi="Calibri"/>
@@ -72,7 +72,7 @@
         </w:rPr>
         <w:t xml:space="preserve">  •  </w:t>
       </w:r>
-      <w:hyperlink w:history="1" r:id="rIddozwo2gfgfii5gj2r4h_r">
+      <w:hyperlink w:history="1" r:id="rIdezuwqvyrfdl_ei4qtca4n">
         <w:r>
           <w:rPr>
             <w:rFonts w:ascii="Calibri" w:cs="Calibri" w:eastAsia="Calibri" w:hAnsi="Calibri"/>
@@ -672,7 +672,7 @@
           <w:sz w:val="20"/>
           <w:szCs w:val="20"/>
         </w:rPr>
-        <w:t xml:space="preserve">Run a 7-team, 40-person release train across Manulife's Core API, Customer Engagement and Compliance AI products, leading end-to-end governance and reporting progress and roadmap decisions to executive leadership.</w:t>
+        <w:t xml:space="preserve">Govern a three-product Manulife portfolio (Core API, Customer Engagement, Compliance AI) through a 7-team, 40-person release train, reporting progress, risks and roadmap decisions to executive leadership.</w:t>
       </w:r>
     </w:p>
     <w:p>
@@ -802,7 +802,7 @@
           <w:sz w:val="20"/>
           <w:szCs w:val="20"/>
         </w:rPr>
-        <w:t xml:space="preserve">Took all 5 modernization initiatives live across 20+ business divisions by guiding teams through coordinated upgrades.</w:t>
+        <w:t xml:space="preserve">Ran a portfolio of 5 modernization initiatives across 20+ business divisions, taking every one live through coordinated upgrades.</w:t>
       </w:r>
     </w:p>
     <w:p>

</xml_diff>

<commit_message>
Client feedback: remove dates and release announcement note; refit spacing
Co-Authored-By: Claude Opus 5.5 <noreply@anthropic.com>
Claude-Session: https://claude.ai/code/session_01MFRrTt7LBDdX57m85KHNGp
</commit_message>
<xml_diff>
--- a/assets/resume/Madhan-Irulandi-Resume.docx
+++ b/assets/resume/Madhan-Irulandi-Resume.docx
@@ -51,7 +51,7 @@
         </w:rPr>
         <w:t xml:space="preserve">Chennai, India (open to relocation worldwide)  •  irulandi.madhan@gmail.com  •  </w:t>
       </w:r>
-      <w:hyperlink w:history="1" r:id="rIdi77k8itpu10xwmfdbtwv2">
+      <w:hyperlink w:history="1" r:id="rId1_3cvqb8w15wkhaldexcu">
         <w:r>
           <w:rPr>
             <w:rFonts w:ascii="Calibri" w:cs="Calibri" w:eastAsia="Calibri" w:hAnsi="Calibri"/>
@@ -72,7 +72,7 @@
         </w:rPr>
         <w:t xml:space="preserve">  •  </w:t>
       </w:r>
-      <w:hyperlink w:history="1" r:id="rIdpgdxvhgcwhlbw-cgadban">
+      <w:hyperlink w:history="1" r:id="rIdlr8ox9mpk74ttmgwqphni">
         <w:r>
           <w:rPr>
             <w:rFonts w:ascii="Calibri" w:cs="Calibri" w:eastAsia="Calibri" w:hAnsi="Calibri"/>
@@ -1639,7 +1639,7 @@
           <w:sz w:val="20"/>
           <w:szCs w:val="20"/>
         </w:rPr>
-        <w:t xml:space="preserve">“Overall, your professionalism, organizational skills, and commitment to agile excellence make a real difference to our delivery and team confidence.” (Client Project Manager, insurance client, Sep 2025 – Apr 2026). Thanked by name in release announcements on 15 Jan, 2 Feb, 12 Feb and 24 Mar 2026.</w:t>
+        <w:t xml:space="preserve">“Overall, your professionalism, organizational skills, and commitment to agile excellence make a real difference to our delivery and team confidence.” (Client Project Manager, insurance client).</w:t>
       </w:r>
     </w:p>
     <w:p>

</xml_diff>

<commit_message>
Predictability 93–100% in blog post and resume
Co-Authored-By: Claude Opus 5.5 <noreply@anthropic.com>
Claude-Session: https://claude.ai/code/session_01MFRrTt7LBDdX57m85KHNGp
</commit_message>
<xml_diff>
--- a/assets/resume/Madhan-Irulandi-Resume.docx
+++ b/assets/resume/Madhan-Irulandi-Resume.docx
@@ -51,7 +51,7 @@
         </w:rPr>
         <w:t xml:space="preserve">Chennai, India (open to relocation worldwide)  •  irulandi.madhan@gmail.com  •  </w:t>
       </w:r>
-      <w:hyperlink w:history="1" r:id="rId1_3cvqb8w15wkhaldexcu">
+      <w:hyperlink w:history="1" r:id="rId_esoyhuxtfohjuo3lhqna">
         <w:r>
           <w:rPr>
             <w:rFonts w:ascii="Calibri" w:cs="Calibri" w:eastAsia="Calibri" w:hAnsi="Calibri"/>
@@ -72,7 +72,7 @@
         </w:rPr>
         <w:t xml:space="preserve">  •  </w:t>
       </w:r>
-      <w:hyperlink w:history="1" r:id="rIdlr8ox9mpk74ttmgwqphni">
+      <w:hyperlink w:history="1" r:id="rIdr0rgldvf3ut0fhmjxnxjk">
         <w:r>
           <w:rPr>
             <w:rFonts w:ascii="Calibri" w:cs="Calibri" w:eastAsia="Calibri" w:hAnsi="Calibri"/>
@@ -178,7 +178,7 @@
           <w:sz w:val="20"/>
           <w:szCs w:val="20"/>
         </w:rPr>
-        <w:t xml:space="preserve">Delivered 100% of planned work in every planning cycle since taking over a 7-team, 40-person release train in Sep 2025, with under 5% sprint variance.</w:t>
+        <w:t xml:space="preserve">Delivered 93–100% of planned work in every planning cycle since taking over a 7-team, 40-person release train in Sep 2025, with under 5% sprint variance.</w:t>
       </w:r>
     </w:p>
     <w:p>
@@ -612,7 +612,7 @@
           <w:sz w:val="20"/>
           <w:szCs w:val="20"/>
         </w:rPr>
-        <w:t xml:space="preserve">Delivered 100% of planned work every planning cycle (ART predictability) through disciplined PI planning.</w:t>
+        <w:t xml:space="preserve">Delivered 93–100% of planned work every planning cycle (ART predictability) through disciplined PI planning.</w:t>
       </w:r>
     </w:p>
     <w:p>

</xml_diff>

<commit_message>
Predictability: 95%+ average across site, blog and resume
Co-Authored-By: Claude Opus 5.5 <noreply@anthropic.com>
Claude-Session: https://claude.ai/code/session_01MFRrTt7LBDdX57m85KHNGp
</commit_message>
<xml_diff>
--- a/assets/resume/Madhan-Irulandi-Resume.docx
+++ b/assets/resume/Madhan-Irulandi-Resume.docx
@@ -51,7 +51,7 @@
         </w:rPr>
         <w:t xml:space="preserve">Chennai, India (open to relocation worldwide)  •  irulandi.madhan@gmail.com  •  </w:t>
       </w:r>
-      <w:hyperlink w:history="1" r:id="rId_esoyhuxtfohjuo3lhqna">
+      <w:hyperlink w:history="1" r:id="rIdwozt9yxhkc7n75ugax7cy">
         <w:r>
           <w:rPr>
             <w:rFonts w:ascii="Calibri" w:cs="Calibri" w:eastAsia="Calibri" w:hAnsi="Calibri"/>
@@ -72,7 +72,7 @@
         </w:rPr>
         <w:t xml:space="preserve">  •  </w:t>
       </w:r>
-      <w:hyperlink w:history="1" r:id="rIdr0rgldvf3ut0fhmjxnxjk">
+      <w:hyperlink w:history="1" r:id="rIdntlhdwvkqejckpqufuq44">
         <w:r>
           <w:rPr>
             <w:rFonts w:ascii="Calibri" w:cs="Calibri" w:eastAsia="Calibri" w:hAnsi="Calibri"/>
@@ -178,7 +178,7 @@
           <w:sz w:val="20"/>
           <w:szCs w:val="20"/>
         </w:rPr>
-        <w:t xml:space="preserve">Delivered 93–100% of planned work in every planning cycle since taking over a 7-team, 40-person release train in Sep 2025, with under 5% sprint variance.</w:t>
+        <w:t xml:space="preserve">Averaged 95%+ of planned work delivered per planning cycle since taking over a 7-team, 40-person release train in Sep 2025, with under 5% sprint variance.</w:t>
       </w:r>
     </w:p>
     <w:p>
@@ -612,7 +612,7 @@
           <w:sz w:val="20"/>
           <w:szCs w:val="20"/>
         </w:rPr>
-        <w:t xml:space="preserve">Delivered 93–100% of planned work every planning cycle (ART predictability) through disciplined PI planning.</w:t>
+        <w:t xml:space="preserve">Averaged 95%+ of planned work delivered each planning cycle (ART predictability) through disciplined PI planning.</w:t>
       </w:r>
     </w:p>
     <w:p>

</xml_diff>